<commit_message>
1.27.3: 예약 실행을 Cloudflare Cron Triggers 로 — cron-job.org 호출이 이전 뒤 403
Co-Authored-By: Claude Opus 5.5 <noreply@anthropic.com>
Claude-Session: https://claude.ai/code/session_01DgqTe4BVpgwGF7str2R4qT
</commit_message>
<xml_diff>
--- a/docs/legal-review/팀킥_약관_처리방침_검토요청_2026-10-11.docx
+++ b/docs/legal-review/팀킥_약관_처리방침_검토요청_2026-10-11.docx
@@ -302,7 +302,7 @@
                 <w:sz w:val="18"/>
                 <w:szCs w:val="18"/>
               </w:rPr>
-              <w:t xml:space="preserve">2026-10-11 (앱 버전 1.27.2)</w:t>
+              <w:t xml:space="preserve">2026-10-11 (앱 버전 1.27.3)</w:t>
             </w:r>
           </w:p>
         </w:tc>
@@ -7321,158 +7321,6 @@
                 <w:szCs w:val="18"/>
               </w:rPr>
               <w:t xml:space="preserve">구장 위치의 5km 격자 좌표·권역 이름(개인정보 아님)</w:t>
-            </w:r>
-          </w:p>
-        </w:tc>
-        <w:tc>
-          <w:tcPr>
-            <w:tcW w:type="dxa" w:w="1300"/>
-            <w:tcBorders>
-              <w:top w:val="single" w:color="BFC5C2" w:sz="4"/>
-              <w:left w:val="single" w:color="BFC5C2" w:sz="4"/>
-              <w:bottom w:val="single" w:color="BFC5C2" w:sz="4"/>
-              <w:right w:val="single" w:color="BFC5C2" w:sz="4"/>
-            </w:tcBorders>
-            <w:tcMar>
-              <w:top w:type="dxa" w:w="60"/>
-              <w:left w:type="dxa" w:w="90"/>
-              <w:bottom w:type="dxa" w:w="60"/>
-              <w:right w:type="dxa" w:w="90"/>
-            </w:tcMar>
-          </w:tcPr>
-          <w:p>
-            <w:pPr>
-              <w:spacing w:after="20"/>
-            </w:pPr>
-            <w:r>
-              <w:rPr>
-                <w:rFonts w:ascii="Malgun Gothic" w:cs="Malgun Gothic" w:eastAsia="Malgun Gothic" w:hAnsi="Malgun Gothic"/>
-                <w:sz w:val="18"/>
-                <w:szCs w:val="18"/>
-              </w:rPr>
-              <w:t xml:space="preserve">—</w:t>
-            </w:r>
-          </w:p>
-        </w:tc>
-      </w:tr>
-      <w:tr>
-        <w:tc>
-          <w:tcPr>
-            <w:tcW w:type="dxa" w:w="2100"/>
-            <w:tcBorders>
-              <w:top w:val="single" w:color="BFC5C2" w:sz="4"/>
-              <w:left w:val="single" w:color="BFC5C2" w:sz="4"/>
-              <w:bottom w:val="single" w:color="BFC5C2" w:sz="4"/>
-              <w:right w:val="single" w:color="BFC5C2" w:sz="4"/>
-            </w:tcBorders>
-            <w:tcMar>
-              <w:top w:type="dxa" w:w="60"/>
-              <w:left w:type="dxa" w:w="90"/>
-              <w:bottom w:type="dxa" w:w="60"/>
-              <w:right w:type="dxa" w:w="90"/>
-            </w:tcMar>
-          </w:tcPr>
-          <w:p>
-            <w:pPr>
-              <w:spacing w:after="20"/>
-            </w:pPr>
-            <w:r>
-              <w:rPr>
-                <w:rFonts w:ascii="Malgun Gothic" w:cs="Malgun Gothic" w:eastAsia="Malgun Gothic" w:hAnsi="Malgun Gothic"/>
-                <w:sz w:val="18"/>
-                <w:szCs w:val="18"/>
-              </w:rPr>
-              <w:t xml:space="preserve">cron-job.org</w:t>
-            </w:r>
-          </w:p>
-        </w:tc>
-        <w:tc>
-          <w:tcPr>
-            <w:tcW w:type="dxa" w:w="900"/>
-            <w:tcBorders>
-              <w:top w:val="single" w:color="BFC5C2" w:sz="4"/>
-              <w:left w:val="single" w:color="BFC5C2" w:sz="4"/>
-              <w:bottom w:val="single" w:color="BFC5C2" w:sz="4"/>
-              <w:right w:val="single" w:color="BFC5C2" w:sz="4"/>
-            </w:tcBorders>
-            <w:tcMar>
-              <w:top w:type="dxa" w:w="60"/>
-              <w:left w:type="dxa" w:w="90"/>
-              <w:bottom w:type="dxa" w:w="60"/>
-              <w:right w:type="dxa" w:w="90"/>
-            </w:tcMar>
-          </w:tcPr>
-          <w:p>
-            <w:pPr>
-              <w:spacing w:after="20"/>
-            </w:pPr>
-            <w:r>
-              <w:rPr>
-                <w:rFonts w:ascii="Malgun Gothic" w:cs="Malgun Gothic" w:eastAsia="Malgun Gothic" w:hAnsi="Malgun Gothic"/>
-                <w:sz w:val="18"/>
-                <w:szCs w:val="18"/>
-              </w:rPr>
-              <w:t xml:space="preserve">해외</w:t>
-            </w:r>
-          </w:p>
-        </w:tc>
-        <w:tc>
-          <w:tcPr>
-            <w:tcW w:type="dxa" w:w="1900"/>
-            <w:tcBorders>
-              <w:top w:val="single" w:color="BFC5C2" w:sz="4"/>
-              <w:left w:val="single" w:color="BFC5C2" w:sz="4"/>
-              <w:bottom w:val="single" w:color="BFC5C2" w:sz="4"/>
-              <w:right w:val="single" w:color="BFC5C2" w:sz="4"/>
-            </w:tcBorders>
-            <w:tcMar>
-              <w:top w:type="dxa" w:w="60"/>
-              <w:left w:type="dxa" w:w="90"/>
-              <w:bottom w:type="dxa" w:w="60"/>
-              <w:right w:type="dxa" w:w="90"/>
-            </w:tcMar>
-          </w:tcPr>
-          <w:p>
-            <w:pPr>
-              <w:spacing w:after="20"/>
-            </w:pPr>
-            <w:r>
-              <w:rPr>
-                <w:rFonts w:ascii="Malgun Gothic" w:cs="Malgun Gothic" w:eastAsia="Malgun Gothic" w:hAnsi="Malgun Gothic"/>
-                <w:sz w:val="18"/>
-                <w:szCs w:val="18"/>
-              </w:rPr>
-              <w:t xml:space="preserve">10분마다 예약 실행 호출</w:t>
-            </w:r>
-          </w:p>
-        </w:tc>
-        <w:tc>
-          <w:tcPr>
-            <w:tcW w:type="dxa" w:w="2826"/>
-            <w:tcBorders>
-              <w:top w:val="single" w:color="BFC5C2" w:sz="4"/>
-              <w:left w:val="single" w:color="BFC5C2" w:sz="4"/>
-              <w:bottom w:val="single" w:color="BFC5C2" w:sz="4"/>
-              <w:right w:val="single" w:color="BFC5C2" w:sz="4"/>
-            </w:tcBorders>
-            <w:tcMar>
-              <w:top w:type="dxa" w:w="60"/>
-              <w:left w:type="dxa" w:w="90"/>
-              <w:bottom w:type="dxa" w:w="60"/>
-              <w:right w:type="dxa" w:w="90"/>
-            </w:tcMar>
-          </w:tcPr>
-          <w:p>
-            <w:pPr>
-              <w:spacing w:after="20"/>
-            </w:pPr>
-            <w:r>
-              <w:rPr>
-                <w:rFonts w:ascii="Malgun Gothic" w:cs="Malgun Gothic" w:eastAsia="Malgun Gothic" w:hAnsi="Malgun Gothic"/>
-                <w:sz w:val="18"/>
-                <w:szCs w:val="18"/>
-              </w:rPr>
-              <w:t xml:space="preserve">주소와 비밀값뿐(개인정보 없음)</w:t>
             </w:r>
           </w:p>
         </w:tc>

</xml_diff>